<commit_message>
Update phone number to (312) 358-6081
Phone number changed across the site and resume.

- Update phone in about and contact components
- Update resume PDF and DOCX
</commit_message>
<xml_diff>
--- a/src/assets/resume/Resume_Megha_Kaul.docx
+++ b/src/assets/resume/Resume_Megha_Kaul.docx
@@ -108,7 +108,17 @@
           <w:szCs w:val="18"/>
           <w:u w:val="none"/>
         </w:rPr>
-        <w:t>315</w:t>
+        <w:t>31</w:t>
+      </w:r>
+      <w:r>
+        <w:rPr>
+          <w:rStyle w:val="Hyperlink"/>
+          <w:color w:val="000000" w:themeColor="text1"/>
+          <w:sz w:val="18"/>
+          <w:szCs w:val="18"/>
+          <w:u w:val="none"/>
+        </w:rPr>
+        <w:t>2</w:t>
       </w:r>
       <w:r>
         <w:rPr>
@@ -5180,25 +5190,6 @@
 </file>
 
 <file path=customXml/item1.xml><?xml version="1.0" encoding="utf-8"?>
-<b:Sources xmlns:b="http://schemas.openxmlformats.org/officeDocument/2006/bibliography" xmlns="http://schemas.openxmlformats.org/officeDocument/2006/bibliography" SelectedStyle="\APASixthEditionOfficeOnline.xsl" StyleName="APA" Version="6"/>
-</file>
-
-<file path=customXml/item2.xml><?xml version="1.0" encoding="utf-8"?>
-<?mso-contentType ?>
-<FormTemplates xmlns="http://schemas.microsoft.com/sharepoint/v3/contenttype/forms">
-  <Display>DocumentLibraryForm</Display>
-  <Edit>DocumentLibraryForm</Edit>
-  <New>DocumentLibraryForm</New>
-</FormTemplates>
-</file>
-
-<file path=customXml/item3.xml><?xml version="1.0" encoding="utf-8"?>
-<p:properties xmlns:p="http://schemas.microsoft.com/office/2006/metadata/properties" xmlns:xsi="http://www.w3.org/2001/XMLSchema-instance" xmlns:pc="http://schemas.microsoft.com/office/infopath/2007/PartnerControls">
-  <documentManagement/>
-</p:properties>
-</file>
-
-<file path=customXml/item4.xml><?xml version="1.0" encoding="utf-8"?>
 <ct:contentTypeSchema xmlns:ct="http://schemas.microsoft.com/office/2006/metadata/contentType" xmlns:ma="http://schemas.microsoft.com/office/2006/metadata/properties/metaAttributes" ct:_="" ma:_="" ma:contentTypeName="Document" ma:contentTypeID="0x010100C62E9F8080EF9045A3461589C8C739D0" ma:contentTypeVersion="12" ma:contentTypeDescription="Create a new document." ma:contentTypeScope="" ma:versionID="b82a4e0cfbba1a4e0025dcf5a4615212">
   <xsd:schema xmlns:xsd="http://www.w3.org/2001/XMLSchema" xmlns:xs="http://www.w3.org/2001/XMLSchema" xmlns:p="http://schemas.microsoft.com/office/2006/metadata/properties" xmlns:ns3="9237417f-6a90-4707-b345-f61fa45bd513" xmlns:ns4="9a6bc8ff-0751-4fb5-b019-c7731e2305e0" targetNamespace="http://schemas.microsoft.com/office/2006/metadata/properties" ma:root="true" ma:fieldsID="8962f9b60b26a87ae6d308e6e9d5b6bd" ns3:_="" ns4:_="">
     <xsd:import namespace="9237417f-6a90-4707-b345-f61fa45bd513"/>
@@ -5415,32 +5406,26 @@
 </ct:contentTypeSchema>
 </file>
 
-<file path=customXml/itemProps1.xml><?xml version="1.0" encoding="utf-8"?>
-<ds:datastoreItem xmlns:ds="http://schemas.openxmlformats.org/officeDocument/2006/customXml" ds:itemID="{CC3DF9CB-EAE3-4358-B00B-AEDD1725FC02}">
-  <ds:schemaRefs>
-    <ds:schemaRef ds:uri="http://schemas.openxmlformats.org/officeDocument/2006/bibliography"/>
-  </ds:schemaRefs>
-</ds:datastoreItem>
+<file path=customXml/item2.xml><?xml version="1.0" encoding="utf-8"?>
+<p:properties xmlns:p="http://schemas.microsoft.com/office/2006/metadata/properties" xmlns:xsi="http://www.w3.org/2001/XMLSchema-instance" xmlns:pc="http://schemas.microsoft.com/office/infopath/2007/PartnerControls">
+  <documentManagement/>
+</p:properties>
 </file>
 
-<file path=customXml/itemProps2.xml><?xml version="1.0" encoding="utf-8"?>
-<ds:datastoreItem xmlns:ds="http://schemas.openxmlformats.org/officeDocument/2006/customXml" ds:itemID="{A6C65B34-06ED-41A8-A3F3-05A1F92025D0}">
-  <ds:schemaRefs>
-    <ds:schemaRef ds:uri="http://schemas.microsoft.com/sharepoint/v3/contenttype/forms"/>
-  </ds:schemaRefs>
-</ds:datastoreItem>
+<file path=customXml/item3.xml><?xml version="1.0" encoding="utf-8"?>
+<?mso-contentType ?>
+<FormTemplates xmlns="http://schemas.microsoft.com/sharepoint/v3/contenttype/forms">
+  <Display>DocumentLibraryForm</Display>
+  <Edit>DocumentLibraryForm</Edit>
+  <New>DocumentLibraryForm</New>
+</FormTemplates>
 </file>
 
-<file path=customXml/itemProps3.xml><?xml version="1.0" encoding="utf-8"?>
-<ds:datastoreItem xmlns:ds="http://schemas.openxmlformats.org/officeDocument/2006/customXml" ds:itemID="{83F54608-22A7-4AF5-943D-E29461CC7B4C}">
-  <ds:schemaRefs>
-    <ds:schemaRef ds:uri="http://schemas.microsoft.com/office/2006/metadata/properties"/>
-    <ds:schemaRef ds:uri="http://schemas.microsoft.com/office/infopath/2007/PartnerControls"/>
-  </ds:schemaRefs>
-</ds:datastoreItem>
+<file path=customXml/item4.xml><?xml version="1.0" encoding="utf-8"?>
+<b:Sources xmlns:b="http://schemas.openxmlformats.org/officeDocument/2006/bibliography" xmlns="http://schemas.openxmlformats.org/officeDocument/2006/bibliography" SelectedStyle="\APASixthEditionOfficeOnline.xsl" StyleName="APA" Version="6"/>
 </file>
 
-<file path=customXml/itemProps4.xml><?xml version="1.0" encoding="utf-8"?>
+<file path=customXml/itemProps1.xml><?xml version="1.0" encoding="utf-8"?>
 <ds:datastoreItem xmlns:ds="http://schemas.openxmlformats.org/officeDocument/2006/customXml" ds:itemID="{2993B305-E746-423D-81B7-32926B0D6054}">
   <ds:schemaRefs>
     <ds:schemaRef ds:uri="http://schemas.microsoft.com/office/2006/metadata/contentType"/>
@@ -5457,4 +5442,29 @@
     <ds:schemaRef ds:uri="http://schemas.microsoft.com/internal/obd"/>
   </ds:schemaRefs>
 </ds:datastoreItem>
+</file>
+
+<file path=customXml/itemProps2.xml><?xml version="1.0" encoding="utf-8"?>
+<ds:datastoreItem xmlns:ds="http://schemas.openxmlformats.org/officeDocument/2006/customXml" ds:itemID="{83F54608-22A7-4AF5-943D-E29461CC7B4C}">
+  <ds:schemaRefs>
+    <ds:schemaRef ds:uri="http://schemas.microsoft.com/office/2006/metadata/properties"/>
+    <ds:schemaRef ds:uri="http://schemas.microsoft.com/office/infopath/2007/PartnerControls"/>
+  </ds:schemaRefs>
+</ds:datastoreItem>
+</file>
+
+<file path=customXml/itemProps3.xml><?xml version="1.0" encoding="utf-8"?>
+<ds:datastoreItem xmlns:ds="http://schemas.openxmlformats.org/officeDocument/2006/customXml" ds:itemID="{A6C65B34-06ED-41A8-A3F3-05A1F92025D0}">
+  <ds:schemaRefs>
+    <ds:schemaRef ds:uri="http://schemas.microsoft.com/sharepoint/v3/contenttype/forms"/>
+  </ds:schemaRefs>
+</ds:datastoreItem>
+</file>
+
+<file path=customXml/itemProps4.xml><?xml version="1.0" encoding="utf-8"?>
+<ds:datastoreItem xmlns:ds="http://schemas.openxmlformats.org/officeDocument/2006/customXml" ds:itemID="{CC3DF9CB-EAE3-4358-B00B-AEDD1725FC02}">
+  <ds:schemaRefs>
+    <ds:schemaRef ds:uri="http://schemas.openxmlformats.org/officeDocument/2006/bibliography"/>
+  </ds:schemaRefs>
+</ds:datastoreItem>
 </file>
</xml_diff>

<commit_message>
Update resume and add cover letter
- Update Resume_Megha_Kaul.docx and .pdf
- Add cover letter PDF
</commit_message>
<xml_diff>
--- a/src/assets/resume/Resume_Megha_Kaul.docx
+++ b/src/assets/resume/Resume_Megha_Kaul.docx
@@ -188,11 +188,13 @@
     </w:p>
     <w:p>
       <w:pPr>
-        <w:ind w:left="274"/>
         <w:jc w:val="right"/>
         <w:rPr>
+          <w:rStyle w:val="Hyperlink"/>
+          <w:color w:val="000000" w:themeColor="text1"/>
           <w:sz w:val="18"/>
           <w:szCs w:val="18"/>
+          <w:u w:val="none"/>
         </w:rPr>
         <w:sectPr>
           <w:type w:val="continuous"/>
@@ -204,16 +206,42 @@
       <w:hyperlink r:id="rId12" w:history="1">
         <w:r>
           <w:rPr>
+            <w:rStyle w:val="Hyperlink"/>
+            <w:color w:val="000000" w:themeColor="text1"/>
             <w:sz w:val="18"/>
             <w:szCs w:val="18"/>
+            <w:u w:val="none"/>
           </w:rPr>
-          <w:t>linkedin.com/in/</w:t>
+          <w:t>linkedin.co</w:t>
+        </w:r>
+        <w:r>
+          <w:rPr>
+            <w:rStyle w:val="Hyperlink"/>
+            <w:color w:val="000000" w:themeColor="text1"/>
+            <w:sz w:val="18"/>
+            <w:szCs w:val="18"/>
+            <w:u w:val="none"/>
+          </w:rPr>
+          <w:t>m</w:t>
+        </w:r>
+        <w:r>
+          <w:rPr>
+            <w:rStyle w:val="Hyperlink"/>
+            <w:color w:val="000000" w:themeColor="text1"/>
+            <w:sz w:val="18"/>
+            <w:szCs w:val="18"/>
+            <w:u w:val="none"/>
+          </w:rPr>
+          <w:t>/in/</w:t>
         </w:r>
         <w:proofErr w:type="spellStart"/>
         <w:r>
           <w:rPr>
+            <w:rStyle w:val="Hyperlink"/>
+            <w:color w:val="000000" w:themeColor="text1"/>
             <w:sz w:val="18"/>
             <w:szCs w:val="18"/>
+            <w:u w:val="none"/>
           </w:rPr>
           <w:t>megha-kaul</w:t>
         </w:r>
@@ -5190,6 +5218,21 @@
 </file>
 
 <file path=customXml/item1.xml><?xml version="1.0" encoding="utf-8"?>
+<?mso-contentType ?>
+<FormTemplates xmlns="http://schemas.microsoft.com/sharepoint/v3/contenttype/forms">
+  <Display>DocumentLibraryForm</Display>
+  <Edit>DocumentLibraryForm</Edit>
+  <New>DocumentLibraryForm</New>
+</FormTemplates>
+</file>
+
+<file path=customXml/item2.xml><?xml version="1.0" encoding="utf-8"?>
+<p:properties xmlns:p="http://schemas.microsoft.com/office/2006/metadata/properties" xmlns:xsi="http://www.w3.org/2001/XMLSchema-instance" xmlns:pc="http://schemas.microsoft.com/office/infopath/2007/PartnerControls">
+  <documentManagement/>
+</p:properties>
+</file>
+
+<file path=customXml/item3.xml><?xml version="1.0" encoding="utf-8"?>
 <ct:contentTypeSchema xmlns:ct="http://schemas.microsoft.com/office/2006/metadata/contentType" xmlns:ma="http://schemas.microsoft.com/office/2006/metadata/properties/metaAttributes" ct:_="" ma:_="" ma:contentTypeName="Document" ma:contentTypeID="0x010100C62E9F8080EF9045A3461589C8C739D0" ma:contentTypeVersion="12" ma:contentTypeDescription="Create a new document." ma:contentTypeScope="" ma:versionID="b82a4e0cfbba1a4e0025dcf5a4615212">
   <xsd:schema xmlns:xsd="http://www.w3.org/2001/XMLSchema" xmlns:xs="http://www.w3.org/2001/XMLSchema" xmlns:p="http://schemas.microsoft.com/office/2006/metadata/properties" xmlns:ns3="9237417f-6a90-4707-b345-f61fa45bd513" xmlns:ns4="9a6bc8ff-0751-4fb5-b019-c7731e2305e0" targetNamespace="http://schemas.microsoft.com/office/2006/metadata/properties" ma:root="true" ma:fieldsID="8962f9b60b26a87ae6d308e6e9d5b6bd" ns3:_="" ns4:_="">
     <xsd:import namespace="9237417f-6a90-4707-b345-f61fa45bd513"/>
@@ -5406,26 +5449,28 @@
 </ct:contentTypeSchema>
 </file>
 
-<file path=customXml/item2.xml><?xml version="1.0" encoding="utf-8"?>
-<p:properties xmlns:p="http://schemas.microsoft.com/office/2006/metadata/properties" xmlns:xsi="http://www.w3.org/2001/XMLSchema-instance" xmlns:pc="http://schemas.microsoft.com/office/infopath/2007/PartnerControls">
-  <documentManagement/>
-</p:properties>
-</file>
-
-<file path=customXml/item3.xml><?xml version="1.0" encoding="utf-8"?>
-<?mso-contentType ?>
-<FormTemplates xmlns="http://schemas.microsoft.com/sharepoint/v3/contenttype/forms">
-  <Display>DocumentLibraryForm</Display>
-  <Edit>DocumentLibraryForm</Edit>
-  <New>DocumentLibraryForm</New>
-</FormTemplates>
-</file>
-
 <file path=customXml/item4.xml><?xml version="1.0" encoding="utf-8"?>
 <b:Sources xmlns:b="http://schemas.openxmlformats.org/officeDocument/2006/bibliography" xmlns="http://schemas.openxmlformats.org/officeDocument/2006/bibliography" SelectedStyle="\APASixthEditionOfficeOnline.xsl" StyleName="APA" Version="6"/>
 </file>
 
 <file path=customXml/itemProps1.xml><?xml version="1.0" encoding="utf-8"?>
+<ds:datastoreItem xmlns:ds="http://schemas.openxmlformats.org/officeDocument/2006/customXml" ds:itemID="{A6C65B34-06ED-41A8-A3F3-05A1F92025D0}">
+  <ds:schemaRefs>
+    <ds:schemaRef ds:uri="http://schemas.microsoft.com/sharepoint/v3/contenttype/forms"/>
+  </ds:schemaRefs>
+</ds:datastoreItem>
+</file>
+
+<file path=customXml/itemProps2.xml><?xml version="1.0" encoding="utf-8"?>
+<ds:datastoreItem xmlns:ds="http://schemas.openxmlformats.org/officeDocument/2006/customXml" ds:itemID="{83F54608-22A7-4AF5-943D-E29461CC7B4C}">
+  <ds:schemaRefs>
+    <ds:schemaRef ds:uri="http://schemas.microsoft.com/office/2006/metadata/properties"/>
+    <ds:schemaRef ds:uri="http://schemas.microsoft.com/office/infopath/2007/PartnerControls"/>
+  </ds:schemaRefs>
+</ds:datastoreItem>
+</file>
+
+<file path=customXml/itemProps3.xml><?xml version="1.0" encoding="utf-8"?>
 <ds:datastoreItem xmlns:ds="http://schemas.openxmlformats.org/officeDocument/2006/customXml" ds:itemID="{2993B305-E746-423D-81B7-32926B0D6054}">
   <ds:schemaRefs>
     <ds:schemaRef ds:uri="http://schemas.microsoft.com/office/2006/metadata/contentType"/>
@@ -5444,23 +5489,6 @@
 </ds:datastoreItem>
 </file>
 
-<file path=customXml/itemProps2.xml><?xml version="1.0" encoding="utf-8"?>
-<ds:datastoreItem xmlns:ds="http://schemas.openxmlformats.org/officeDocument/2006/customXml" ds:itemID="{83F54608-22A7-4AF5-943D-E29461CC7B4C}">
-  <ds:schemaRefs>
-    <ds:schemaRef ds:uri="http://schemas.microsoft.com/office/2006/metadata/properties"/>
-    <ds:schemaRef ds:uri="http://schemas.microsoft.com/office/infopath/2007/PartnerControls"/>
-  </ds:schemaRefs>
-</ds:datastoreItem>
-</file>
-
-<file path=customXml/itemProps3.xml><?xml version="1.0" encoding="utf-8"?>
-<ds:datastoreItem xmlns:ds="http://schemas.openxmlformats.org/officeDocument/2006/customXml" ds:itemID="{A6C65B34-06ED-41A8-A3F3-05A1F92025D0}">
-  <ds:schemaRefs>
-    <ds:schemaRef ds:uri="http://schemas.microsoft.com/sharepoint/v3/contenttype/forms"/>
-  </ds:schemaRefs>
-</ds:datastoreItem>
-</file>
-
 <file path=customXml/itemProps4.xml><?xml version="1.0" encoding="utf-8"?>
 <ds:datastoreItem xmlns:ds="http://schemas.openxmlformats.org/officeDocument/2006/customXml" ds:itemID="{CC3DF9CB-EAE3-4358-B00B-AEDD1725FC02}">
   <ds:schemaRefs>

</xml_diff>